<commit_message>
Agrega base del modulo de estructura
</commit_message>
<xml_diff>
--- a/docs/reference/documentos_funcionales/App_Cotizacion_Solar_v2.docx
+++ b/docs/reference/documentos_funcionales/App_Cotizacion_Solar_v2.docx
@@ -528,19 +528,11 @@
       </w:r>
       <w:proofErr w:type="spellStart"/>
       <w:r>
-        <w:t>Numero_</w:t>
-      </w:r>
-      <w:proofErr w:type="gramStart"/>
-      <w:r>
-        <w:t>paneles</w:t>
-      </w:r>
-      <w:proofErr w:type="spellEnd"/>
-      <w:r>
-        <w:t>(</w:t>
-      </w:r>
-      <w:proofErr w:type="gramEnd"/>
-      <w:r>
-        <w:t xml:space="preserve">Pantalla5:paneles_screen) </w:t>
+        <w:t>Numero_paneles</w:t>
+      </w:r>
+      <w:proofErr w:type="spellEnd"/>
+      <w:r>
+        <w:t xml:space="preserve">(Pantalla5:paneles_screen) </w:t>
       </w:r>
     </w:p>
     <w:p>
@@ -587,19 +579,11 @@
       </w:r>
       <w:proofErr w:type="spellStart"/>
       <w:r>
-        <w:t>estructura_</w:t>
-      </w:r>
-      <w:proofErr w:type="gramStart"/>
-      <w:r>
-        <w:t>screen</w:t>
-      </w:r>
-      <w:proofErr w:type="spellEnd"/>
-      <w:r>
-        <w:t>(</w:t>
-      </w:r>
-      <w:proofErr w:type="gramEnd"/>
-      <w:r>
-        <w:t>Pantalla7:estructura_screen)</w:t>
+        <w:t>estructura_screen</w:t>
+      </w:r>
+      <w:proofErr w:type="spellEnd"/>
+      <w:r>
+        <w:t>(Pantalla7:estructura_screen)</w:t>
       </w:r>
     </w:p>
     <w:p>
@@ -1991,15 +1975,7 @@
         <w:t>Si la distancia del inversor al centro de carga es menor a 17 metros</w:t>
       </w:r>
       <w:r>
-        <w:t xml:space="preserve"> se </w:t>
-      </w:r>
-      <w:proofErr w:type="gramStart"/>
-      <w:r>
-        <w:t>usara</w:t>
-      </w:r>
-      <w:proofErr w:type="gramEnd"/>
-      <w:r>
-        <w:t xml:space="preserve"> el mismo calibre que ya se venía usando</w:t>
+        <w:t xml:space="preserve"> se usara el mismo calibre que ya se venía usando</w:t>
       </w:r>
     </w:p>
     <w:p>
@@ -2605,6 +2581,18 @@
         </w:numPr>
       </w:pPr>
       <w:r>
+        <w:t xml:space="preserve">Para el cálculo del numero de filas de patas por estructura será con el siguiente criterio: si el numero de filas de paneles es de 1 – 3, será: No. De filas de patas = (numero de filas de paneles) +1, para filas de paneles mayores a 3 se usara el criterio de No de filas de patas = (Numero de filas de paneles) + 2 </w:t>
+      </w:r>
+    </w:p>
+    <w:p>
+      <w:pPr>
+        <w:pStyle w:val="Prrafodelista"/>
+        <w:numPr>
+          <w:ilvl w:val="0"/>
+          <w:numId w:val="23"/>
+        </w:numPr>
+      </w:pPr>
+      <w:r>
         <w:t>C</w:t>
       </w:r>
       <w:r>
@@ -2736,7 +2724,7 @@
           </mc:Choice>
           <mc:Fallback>
             <w:pict>
-              <v:rect w14:anchorId="3848BD09" id="Rectángulo 2" o:spid="_x0000_s1026" style="position:absolute;margin-left:184.2pt;margin-top:7.1pt;width:61.8pt;height:91.8pt;z-index:251654144;visibility:visible;mso-wrap-style:square;mso-wrap-distance-left:9pt;mso-wrap-distance-top:0;mso-wrap-distance-right:9pt;mso-wrap-distance-bottom:0;mso-position-horizontal:absolute;mso-position-horizontal-relative:text;mso-position-vertical:absolute;mso-position-vertical-relative:text;v-text-anchor:middle" o:gfxdata="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" fillcolor="white [3201]" strokecolor="black [3200]" strokeweight="2pt"/>
+              <v:rect w14:anchorId="4E0DF8A6" id="Rectángulo 2" o:spid="_x0000_s1026" style="position:absolute;margin-left:184.2pt;margin-top:7.1pt;width:61.8pt;height:91.8pt;z-index:251654144;visibility:visible;mso-wrap-style:square;mso-wrap-distance-left:9pt;mso-wrap-distance-top:0;mso-wrap-distance-right:9pt;mso-wrap-distance-bottom:0;mso-position-horizontal:absolute;mso-position-horizontal-relative:text;mso-position-vertical:absolute;mso-position-vertical-relative:text;v-text-anchor:middle" o:gfxdata="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" fillcolor="white [3201]" strokecolor="black [3200]" strokeweight="2pt"/>
             </w:pict>
           </mc:Fallback>
         </mc:AlternateContent>
@@ -3063,6 +3051,7 @@
         </w:numPr>
       </w:pPr>
       <w:r>
+        <w:lastRenderedPageBreak/>
         <w:t>Para calcular el número de patas que requiera cada fila será el numero de paneles por fila menos 1 y este valor se multiplicara por cada fila, todas las estructuras llevaran tres filas de patas, delanteras, intermedias y traseras</w:t>
       </w:r>
     </w:p>
@@ -3087,12 +3076,14 @@
         </w:numPr>
       </w:pPr>
       <w:r>
-        <w:lastRenderedPageBreak/>
         <w:t xml:space="preserve">Usando el </w:t>
       </w:r>
       <w:proofErr w:type="spellStart"/>
       <w:r>
-        <w:t>valor_verticla</w:t>
+        <w:t>valor_vertic</w:t>
+      </w:r>
+      <w:r>
+        <w:t>al</w:t>
       </w:r>
       <w:proofErr w:type="spellEnd"/>
       <w:r>
@@ -3255,11 +3246,9 @@
       <w:r>
         <w:t xml:space="preserve"> usando la medida de pata trasera, siendo este el cateto opuesto y la distancia entre patas como cateto adyacente; el largo del rompevientos será igual a la hipotenusa de estos dos catetos </w:t>
       </w:r>
-      <w:proofErr w:type="spellStart"/>
-      <w:r>
-        <w:t>mas</w:t>
-      </w:r>
-      <w:proofErr w:type="spellEnd"/>
+      <w:r>
+        <w:t>más</w:t>
+      </w:r>
       <w:r>
         <w:t xml:space="preserve"> 10 cm y siempre se ocupan 2 entonces se multiplicara por 2 siempre, hasta aquí se sumaran todas estas medidas y mostrara el resultado total de “Material de Angulo” necesario y después se dividirá entre 6 y mostrara el resultado para comprar el en tramos de 6 metros que se ocupa.</w:t>
       </w:r>
@@ -3400,7 +3389,11 @@
         </w:numPr>
       </w:pPr>
       <w:r>
-        <w:t>Se multiplica la cantidad necesaria por el tamaño del riel y se comparará con las siguientes medidas vendidas, asumiendo que la recomendación deberá ser siempre mayor, hay solo 2 opciones tramos comerciales de 4.8 metros y 6 metros, se pueden combinar para ajustar la cantidad necesaria siempre tratando de que haya la menor cantidad de desperdicio de material</w:t>
+        <w:t xml:space="preserve">Se multiplica la cantidad necesaria por el tamaño del riel y se comparará con las siguientes medidas vendidas, asumiendo que la recomendación deberá ser siempre </w:t>
+      </w:r>
+      <w:r>
+        <w:lastRenderedPageBreak/>
+        <w:t>mayor, hay solo 2 opciones tramos comerciales de 4.8 metros y 6 metros, se pueden combinar para ajustar la cantidad necesaria siempre tratando de que haya la menor cantidad de desperdicio de material</w:t>
       </w:r>
     </w:p>
     <w:p/>
@@ -3414,7 +3407,6 @@
       </w:pPr>
       <w:proofErr w:type="spellStart"/>
       <w:r>
-        <w:lastRenderedPageBreak/>
         <w:t>Calculo</w:t>
       </w:r>
       <w:proofErr w:type="spellEnd"/>
@@ -4050,6 +4042,7 @@
         <w:rPr>
           <w:lang w:val="es-MX"/>
         </w:rPr>
+        <w:lastRenderedPageBreak/>
         <w:t xml:space="preserve">Al final se deberá hacer la suma total de los precios, </w:t>
       </w:r>
       <w:r>
@@ -4308,7 +4301,7 @@
       </w:pPr>
       <w:r>
         <w:pict w14:anchorId="46F16755">
-          <v:rect id="_x0000_i1169" style="width:0;height:1.5pt" o:hralign="center" o:hrstd="t" o:hr="t" fillcolor="#a0a0a0" stroked="f"/>
+          <v:rect id="_x0000_i1025" style="width:0;height:1.5pt" o:hralign="center" o:hrstd="t" o:hr="t" fillcolor="#a0a0a0" stroked="f"/>
         </w:pict>
       </w:r>
     </w:p>
@@ -4368,7 +4361,7 @@
       </w:pPr>
       <w:r>
         <w:pict w14:anchorId="3615F488">
-          <v:rect id="_x0000_i1170" style="width:0;height:1.5pt" o:hralign="center" o:hrstd="t" o:hr="t" fillcolor="#a0a0a0" stroked="f"/>
+          <v:rect id="_x0000_i1026" style="width:0;height:1.5pt" o:hralign="center" o:hrstd="t" o:hr="t" fillcolor="#a0a0a0" stroked="f"/>
         </w:pict>
       </w:r>
     </w:p>
@@ -4577,7 +4570,7 @@
       </w:pPr>
       <w:r>
         <w:pict w14:anchorId="0352D848">
-          <v:rect id="_x0000_i1171" style="width:0;height:1.5pt" o:hralign="center" o:hrstd="t" o:hr="t" fillcolor="#a0a0a0" stroked="f"/>
+          <v:rect id="_x0000_i1027" style="width:0;height:1.5pt" o:hralign="center" o:hrstd="t" o:hr="t" fillcolor="#a0a0a0" stroked="f"/>
         </w:pict>
       </w:r>
     </w:p>
@@ -5105,7 +5098,7 @@
       </w:pPr>
       <w:r>
         <w:pict w14:anchorId="1C3FF197">
-          <v:rect id="_x0000_i1172" style="width:0;height:1.5pt" o:hralign="center" o:hrstd="t" o:hr="t" fillcolor="#a0a0a0" stroked="f"/>
+          <v:rect id="_x0000_i1028" style="width:0;height:1.5pt" o:hralign="center" o:hrstd="t" o:hr="t" fillcolor="#a0a0a0" stroked="f"/>
         </w:pict>
       </w:r>
     </w:p>
@@ -6962,7 +6955,7 @@
       </w:pPr>
       <w:r>
         <w:pict w14:anchorId="5C23E082">
-          <v:rect id="_x0000_i1173" style="width:0;height:1.5pt" o:hralign="center" o:hrstd="t" o:hr="t" fillcolor="#a0a0a0" stroked="f"/>
+          <v:rect id="_x0000_i1029" style="width:0;height:1.5pt" o:hralign="center" o:hrstd="t" o:hr="t" fillcolor="#a0a0a0" stroked="f"/>
         </w:pict>
       </w:r>
     </w:p>
@@ -8273,7 +8266,7 @@
       </w:pPr>
       <w:r>
         <w:pict w14:anchorId="6768C3F9">
-          <v:rect id="_x0000_i1174" style="width:0;height:1.5pt" o:hralign="center" o:hrstd="t" o:hr="t" fillcolor="#a0a0a0" stroked="f"/>
+          <v:rect id="_x0000_i1030" style="width:0;height:1.5pt" o:hralign="center" o:hrstd="t" o:hr="t" fillcolor="#a0a0a0" stroked="f"/>
         </w:pict>
       </w:r>
     </w:p>
@@ -8799,7 +8792,7 @@
       </w:pPr>
       <w:r>
         <w:pict w14:anchorId="3933251D">
-          <v:rect id="_x0000_i1175" style="width:0;height:1.5pt" o:hralign="center" o:hrstd="t" o:hr="t" fillcolor="#a0a0a0" stroked="f"/>
+          <v:rect id="_x0000_i1031" style="width:0;height:1.5pt" o:hralign="center" o:hrstd="t" o:hr="t" fillcolor="#a0a0a0" stroked="f"/>
         </w:pict>
       </w:r>
     </w:p>
@@ -9338,7 +9331,7 @@
       </w:pPr>
       <w:r>
         <w:pict w14:anchorId="7A239476">
-          <v:rect id="_x0000_i1176" style="width:0;height:1.5pt" o:hralign="center" o:hrstd="t" o:hr="t" fillcolor="#a0a0a0" stroked="f"/>
+          <v:rect id="_x0000_i1032" style="width:0;height:1.5pt" o:hralign="center" o:hrstd="t" o:hr="t" fillcolor="#a0a0a0" stroked="f"/>
         </w:pict>
       </w:r>
     </w:p>
@@ -9642,7 +9635,7 @@
       </w:pPr>
       <w:r>
         <w:pict w14:anchorId="42036548">
-          <v:rect id="_x0000_i1177" style="width:0;height:1.5pt" o:hralign="center" o:hrstd="t" o:hr="t" fillcolor="#a0a0a0" stroked="f"/>
+          <v:rect id="_x0000_i1033" style="width:0;height:1.5pt" o:hralign="center" o:hrstd="t" o:hr="t" fillcolor="#a0a0a0" stroked="f"/>
         </w:pict>
       </w:r>
     </w:p>
@@ -10200,7 +10193,7 @@
       </w:pPr>
       <w:r>
         <w:pict w14:anchorId="17516316">
-          <v:rect id="_x0000_i1178" style="width:0;height:1.5pt" o:hralign="center" o:hrstd="t" o:hr="t" fillcolor="#a0a0a0" stroked="f"/>
+          <v:rect id="_x0000_i1034" style="width:0;height:1.5pt" o:hralign="center" o:hrstd="t" o:hr="t" fillcolor="#a0a0a0" stroked="f"/>
         </w:pict>
       </w:r>
     </w:p>
@@ -10915,7 +10908,7 @@
       </w:pPr>
       <w:r>
         <w:pict w14:anchorId="2852F3FF">
-          <v:rect id="_x0000_i1179" style="width:0;height:1.5pt" o:hralign="center" o:hrstd="t" o:hr="t" fillcolor="#a0a0a0" stroked="f"/>
+          <v:rect id="_x0000_i1035" style="width:0;height:1.5pt" o:hralign="center" o:hrstd="t" o:hr="t" fillcolor="#a0a0a0" stroked="f"/>
         </w:pict>
       </w:r>
     </w:p>
@@ -11549,7 +11542,7 @@
       </w:pPr>
       <w:r>
         <w:pict w14:anchorId="11674F89">
-          <v:rect id="_x0000_i1180" style="width:0;height:1.5pt" o:hralign="center" o:hrstd="t" o:hr="t" fillcolor="#a0a0a0" stroked="f"/>
+          <v:rect id="_x0000_i1036" style="width:0;height:1.5pt" o:hralign="center" o:hrstd="t" o:hr="t" fillcolor="#a0a0a0" stroked="f"/>
         </w:pict>
       </w:r>
     </w:p>
@@ -12300,7 +12293,7 @@
       </w:pPr>
       <w:r>
         <w:pict w14:anchorId="436302B3">
-          <v:rect id="_x0000_i1181" style="width:0;height:1.5pt" o:hralign="center" o:hrstd="t" o:hr="t" fillcolor="#a0a0a0" stroked="f"/>
+          <v:rect id="_x0000_i1037" style="width:0;height:1.5pt" o:hralign="center" o:hrstd="t" o:hr="t" fillcolor="#a0a0a0" stroked="f"/>
         </w:pict>
       </w:r>
     </w:p>
@@ -12627,7 +12620,7 @@
       </w:pPr>
       <w:r>
         <w:pict w14:anchorId="486B7541">
-          <v:rect id="_x0000_i1182" style="width:0;height:1.5pt" o:hralign="center" o:hrstd="t" o:hr="t" fillcolor="#a0a0a0" stroked="f"/>
+          <v:rect id="_x0000_i1038" style="width:0;height:1.5pt" o:hralign="center" o:hrstd="t" o:hr="t" fillcolor="#a0a0a0" stroked="f"/>
         </w:pict>
       </w:r>
     </w:p>
@@ -13845,7 +13838,7 @@
       </w:pPr>
       <w:r>
         <w:pict w14:anchorId="5D7E0B7D">
-          <v:rect id="_x0000_i1183" style="width:0;height:1.5pt" o:hralign="center" o:hrstd="t" o:hr="t" fillcolor="#a0a0a0" stroked="f"/>
+          <v:rect id="_x0000_i1039" style="width:0;height:1.5pt" o:hralign="center" o:hrstd="t" o:hr="t" fillcolor="#a0a0a0" stroked="f"/>
         </w:pict>
       </w:r>
     </w:p>
@@ -14769,7 +14762,7 @@
       </w:pPr>
       <w:r>
         <w:pict w14:anchorId="478BA230">
-          <v:rect id="_x0000_i1184" style="width:0;height:1.5pt" o:hralign="center" o:hrstd="t" o:hr="t" fillcolor="#a0a0a0" stroked="f"/>
+          <v:rect id="_x0000_i1040" style="width:0;height:1.5pt" o:hralign="center" o:hrstd="t" o:hr="t" fillcolor="#a0a0a0" stroked="f"/>
         </w:pict>
       </w:r>
     </w:p>
@@ -15838,7 +15831,7 @@
       </w:pPr>
       <w:r>
         <w:pict w14:anchorId="52D9D4DE">
-          <v:rect id="_x0000_i1185" style="width:0;height:1.5pt" o:hralign="center" o:hrstd="t" o:hr="t" fillcolor="#a0a0a0" stroked="f"/>
+          <v:rect id="_x0000_i1041" style="width:0;height:1.5pt" o:hralign="center" o:hrstd="t" o:hr="t" fillcolor="#a0a0a0" stroked="f"/>
         </w:pict>
       </w:r>
     </w:p>
@@ -16945,7 +16938,7 @@
       </w:pPr>
       <w:r>
         <w:pict w14:anchorId="09C822CA">
-          <v:rect id="_x0000_i1186" style="width:0;height:1.5pt" o:hralign="center" o:hrstd="t" o:hr="t" fillcolor="#a0a0a0" stroked="f"/>
+          <v:rect id="_x0000_i1042" style="width:0;height:1.5pt" o:hralign="center" o:hrstd="t" o:hr="t" fillcolor="#a0a0a0" stroked="f"/>
         </w:pict>
       </w:r>
     </w:p>
@@ -17454,7 +17447,7 @@
       </w:pPr>
       <w:r>
         <w:pict w14:anchorId="5DEB6690">
-          <v:rect id="_x0000_i1187" style="width:0;height:1.5pt" o:hralign="center" o:hrstd="t" o:hr="t" fillcolor="#a0a0a0" stroked="f"/>
+          <v:rect id="_x0000_i1043" style="width:0;height:1.5pt" o:hralign="center" o:hrstd="t" o:hr="t" fillcolor="#a0a0a0" stroked="f"/>
         </w:pict>
       </w:r>
     </w:p>
@@ -18567,7 +18560,7 @@
       </w:pPr>
       <w:r>
         <w:pict w14:anchorId="2ACA9195">
-          <v:rect id="_x0000_i1188" style="width:0;height:1.5pt" o:hralign="center" o:hrstd="t" o:hr="t" fillcolor="#a0a0a0" stroked="f"/>
+          <v:rect id="_x0000_i1044" style="width:0;height:1.5pt" o:hralign="center" o:hrstd="t" o:hr="t" fillcolor="#a0a0a0" stroked="f"/>
         </w:pict>
       </w:r>
     </w:p>
@@ -18847,7 +18840,7 @@
       </w:pPr>
       <w:r>
         <w:pict w14:anchorId="383FD0DA">
-          <v:rect id="_x0000_i1189" style="width:0;height:1.5pt" o:hralign="center" o:hrstd="t" o:hr="t" fillcolor="#a0a0a0" stroked="f"/>
+          <v:rect id="_x0000_i1045" style="width:0;height:1.5pt" o:hralign="center" o:hrstd="t" o:hr="t" fillcolor="#a0a0a0" stroked="f"/>
         </w:pict>
       </w:r>
     </w:p>
@@ -19410,7 +19403,7 @@
       </w:pPr>
       <w:r>
         <w:pict w14:anchorId="033C1F3B">
-          <v:rect id="_x0000_i1190" style="width:0;height:1.5pt" o:hralign="center" o:hrstd="t" o:hr="t" fillcolor="#a0a0a0" stroked="f"/>
+          <v:rect id="_x0000_i1046" style="width:0;height:1.5pt" o:hralign="center" o:hrstd="t" o:hr="t" fillcolor="#a0a0a0" stroked="f"/>
         </w:pict>
       </w:r>
     </w:p>
@@ -20024,7 +20017,7 @@
       </w:pPr>
       <w:r>
         <w:pict w14:anchorId="3486BA5B">
-          <v:rect id="_x0000_i1191" style="width:0;height:1.5pt" o:hralign="center" o:hrstd="t" o:hr="t" fillcolor="#a0a0a0" stroked="f"/>
+          <v:rect id="_x0000_i1047" style="width:0;height:1.5pt" o:hralign="center" o:hrstd="t" o:hr="t" fillcolor="#a0a0a0" stroked="f"/>
         </w:pict>
       </w:r>
     </w:p>
@@ -20374,7 +20367,7 @@
       </w:pPr>
       <w:r>
         <w:pict w14:anchorId="2FA7F713">
-          <v:rect id="_x0000_i1192" style="width:0;height:1.5pt" o:hralign="center" o:hrstd="t" o:hr="t" fillcolor="#a0a0a0" stroked="f"/>
+          <v:rect id="_x0000_i1048" style="width:0;height:1.5pt" o:hralign="center" o:hrstd="t" o:hr="t" fillcolor="#a0a0a0" stroked="f"/>
         </w:pict>
       </w:r>
     </w:p>
@@ -33063,6 +33056,7 @@
   <w:style w:type="character" w:default="1" w:styleId="Fuentedeprrafopredeter">
     <w:name w:val="Default Paragraph Font"/>
     <w:uiPriority w:val="1"/>
+    <w:semiHidden/>
     <w:unhideWhenUsed/>
   </w:style>
   <w:style w:type="table" w:default="1" w:styleId="Tablanormal">

</xml_diff>